<commit_message>
Feature Signal Sprint first and update technical CV downloads
</commit_message>
<xml_diff>
--- a/Abiy_Mamo_CV.docx
+++ b/Abiy_Mamo_CV.docx
@@ -5,6 +5,7 @@
     <w:p>
       <w:pPr>
         <w:pStyle w:val="Title"/>
+        <w:spacing w:after="0"/>
         <w:jc w:val="center"/>
       </w:pPr>
       <w:r>
@@ -17,7 +18,7 @@
     </w:p>
     <w:p>
       <w:pPr>
-        <w:spacing w:after="30"/>
+        <w:spacing w:after="0"/>
         <w:jc w:val="center"/>
       </w:pPr>
       <w:r>
@@ -30,7 +31,7 @@
     </w:p>
     <w:p>
       <w:pPr>
-        <w:spacing w:after="30"/>
+        <w:spacing w:after="0"/>
         <w:jc w:val="center"/>
       </w:pPr>
       <w:r>
@@ -43,7 +44,7 @@
     </w:p>
     <w:p>
       <w:pPr>
-        <w:spacing w:after="20"/>
+        <w:spacing w:after="0"/>
         <w:jc w:val="center"/>
       </w:pPr>
       <w:r>
@@ -79,7 +80,7 @@
     </w:p>
     <w:p>
       <w:pPr>
-        <w:spacing w:after="40"/>
+        <w:spacing w:after="0"/>
         <w:jc w:val="center"/>
       </w:pPr>
       <w:r>
@@ -108,7 +109,7 @@
     <w:p>
       <w:pPr>
         <w:pStyle w:val="Heading1"/>
-        <w:spacing w:before="100"/>
+        <w:spacing w:before="60" w:after="0"/>
         <w:pBdr>
           <w:bottom w:val="single" w:sz="4" w:color="B9D8E6" w:space="3"/>
         </w:pBdr>
@@ -122,7 +123,7 @@
     </w:p>
     <w:p>
       <w:pPr>
-        <w:spacing w:after="30"/>
+        <w:spacing w:after="0"/>
       </w:pPr>
       <w:r>
         <w:rPr>
@@ -133,7 +134,7 @@
     </w:p>
     <w:p>
       <w:pPr>
-        <w:spacing w:after="40"/>
+        <w:spacing w:after="0"/>
       </w:pPr>
       <w:r>
         <w:rPr>
@@ -144,7 +145,7 @@
     </w:p>
     <w:p>
       <w:pPr>
-        <w:spacing w:after="30"/>
+        <w:spacing w:after="0"/>
       </w:pPr>
       <w:r>
         <w:rPr>
@@ -155,7 +156,7 @@
     </w:p>
     <w:p>
       <w:pPr>
-        <w:spacing w:after="40"/>
+        <w:spacing w:after="0"/>
       </w:pPr>
       <w:r>
         <w:rPr>
@@ -167,7 +168,7 @@
     <w:p>
       <w:pPr>
         <w:pStyle w:val="Heading1"/>
-        <w:spacing w:before="100"/>
+        <w:spacing w:before="60" w:after="0"/>
         <w:pBdr>
           <w:bottom w:val="single" w:sz="4" w:color="B9D8E6" w:space="3"/>
         </w:pBdr>
@@ -181,7 +182,7 @@
     </w:p>
     <w:p>
       <w:pPr>
-        <w:spacing w:after="30"/>
+        <w:spacing w:after="0"/>
       </w:pPr>
       <w:r>
         <w:rPr>
@@ -192,7 +193,7 @@
     </w:p>
     <w:p>
       <w:pPr>
-        <w:spacing w:after="30"/>
+        <w:spacing w:after="0"/>
       </w:pPr>
       <w:r>
         <w:rPr>
@@ -203,7 +204,7 @@
     </w:p>
     <w:p>
       <w:pPr>
-        <w:spacing w:after="30"/>
+        <w:spacing w:after="0"/>
       </w:pPr>
       <w:r>
         <w:rPr>
@@ -215,7 +216,7 @@
     <w:p>
       <w:pPr>
         <w:pStyle w:val="Heading1"/>
-        <w:spacing w:before="100"/>
+        <w:spacing w:before="60" w:after="0"/>
         <w:pBdr>
           <w:bottom w:val="single" w:sz="4" w:color="B9D8E6" w:space="3"/>
         </w:pBdr>
@@ -233,7 +234,7 @@
         <w:tabs>
           <w:tab w:pos="10570" w:val="right"/>
         </w:tabs>
-        <w:spacing w:after="30"/>
+        <w:spacing w:after="0"/>
       </w:pPr>
       <w:r>
         <w:rPr>
@@ -253,7 +254,7 @@
     </w:p>
     <w:p>
       <w:pPr>
-        <w:spacing w:after="30"/>
+        <w:spacing w:after="0"/>
         <w:ind w:left="173" w:hanging="173"/>
       </w:pPr>
       <w:r>
@@ -269,7 +270,7 @@
         <w:tabs>
           <w:tab w:pos="10570" w:val="right"/>
         </w:tabs>
-        <w:spacing w:after="30"/>
+        <w:spacing w:after="0"/>
       </w:pPr>
       <w:r>
         <w:rPr>
@@ -289,7 +290,7 @@
     </w:p>
     <w:p>
       <w:pPr>
-        <w:spacing w:after="30"/>
+        <w:spacing w:after="0"/>
         <w:ind w:left="173" w:hanging="173"/>
       </w:pPr>
       <w:r>
@@ -305,7 +306,7 @@
         <w:tabs>
           <w:tab w:pos="10570" w:val="right"/>
         </w:tabs>
-        <w:spacing w:after="30"/>
+        <w:spacing w:after="0"/>
       </w:pPr>
       <w:r>
         <w:rPr>
@@ -325,7 +326,7 @@
     </w:p>
     <w:p>
       <w:pPr>
-        <w:spacing w:after="30"/>
+        <w:spacing w:after="0"/>
         <w:ind w:left="173" w:hanging="173"/>
       </w:pPr>
       <w:r>
@@ -338,7 +339,7 @@
     <w:p>
       <w:pPr>
         <w:pStyle w:val="Heading1"/>
-        <w:spacing w:before="100"/>
+        <w:spacing w:before="60" w:after="0"/>
         <w:pBdr>
           <w:bottom w:val="single" w:sz="4" w:color="B9D8E6" w:space="3"/>
         </w:pBdr>
@@ -353,7 +354,47 @@
     <w:p>
       <w:pPr>
         <w:keepNext/>
-        <w:spacing w:after="30"/>
+        <w:spacing w:after="0"/>
+      </w:pPr>
+      <w:r>
+        <w:rPr>
+          <w:b/>
+        </w:rPr>
+        <w:t>Signal Sprint | React, TypeScript, Cloudflare Workers, D1</w:t>
+      </w:r>
+    </w:p>
+    <w:p>
+      <w:pPr>
+        <w:keepNext/>
+        <w:spacing w:after="0"/>
+      </w:pPr>
+      <w:r>
+        <w:rPr>
+          <w:b w:val="0"/>
+        </w:rPr>
+      </w:r>
+      <w:hyperlink r:id="rId20">
+        <w:r>
+          <w:t>GitHub / signal_sprint</w:t>
+        </w:r>
+      </w:hyperlink>
+    </w:p>
+    <w:p>
+      <w:pPr>
+        <w:spacing w:after="0"/>
+        <w:ind w:left="173" w:hanging="173"/>
+      </w:pPr>
+      <w:r>
+        <w:rPr>
+          <w:b w:val="0"/>
+        </w:rPr>
+        <w:t>• Built a 2-8 player logic game with room codes, synchronized rounds, server-side scoring and persistent state; tested two-player synchronization and six-round scoring and authorization.</w:t>
+      </w:r>
+    </w:p>
+    <w:p>
+      <w:pPr>
+        <w:keepNext/>
+        <w:spacing w:after="0"/>
       </w:pPr>
       <w:r>
         <w:rPr>
@@ -365,7 +406,7 @@
     <w:p>
       <w:pPr>
         <w:keepNext/>
-        <w:spacing w:after="20"/>
+        <w:spacing w:after="0"/>
       </w:pPr>
       <w:r>
         <w:rPr>
@@ -386,7 +427,7 @@
     </w:p>
     <w:p>
       <w:pPr>
-        <w:spacing w:after="30"/>
+        <w:spacing w:after="0"/>
         <w:ind w:left="173" w:hanging="173"/>
       </w:pPr>
       <w:r>
@@ -399,7 +440,7 @@
     <w:p>
       <w:pPr>
         <w:keepNext/>
-        <w:spacing w:after="30"/>
+        <w:spacing w:after="0"/>
       </w:pPr>
       <w:r>
         <w:rPr>
@@ -411,7 +452,7 @@
     <w:p>
       <w:pPr>
         <w:keepNext/>
-        <w:spacing w:after="20"/>
+        <w:spacing w:after="0"/>
       </w:pPr>
       <w:r>
         <w:rPr>
@@ -432,7 +473,7 @@
     </w:p>
     <w:p>
       <w:pPr>
-        <w:spacing w:after="30"/>
+        <w:spacing w:after="0"/>
         <w:ind w:left="173" w:hanging="173"/>
       </w:pPr>
       <w:r>
@@ -445,7 +486,7 @@
     <w:p>
       <w:pPr>
         <w:keepNext/>
-        <w:spacing w:after="30"/>
+        <w:spacing w:after="0"/>
       </w:pPr>
       <w:r>
         <w:rPr>
@@ -457,7 +498,7 @@
     <w:p>
       <w:pPr>
         <w:keepNext/>
-        <w:spacing w:after="20"/>
+        <w:spacing w:after="0"/>
       </w:pPr>
       <w:r>
         <w:rPr>
@@ -478,7 +519,7 @@
     </w:p>
     <w:p>
       <w:pPr>
-        <w:spacing w:after="30"/>
+        <w:spacing w:after="0"/>
         <w:ind w:left="173" w:hanging="173"/>
       </w:pPr>
       <w:r>
@@ -491,7 +532,7 @@
     <w:p>
       <w:pPr>
         <w:keepNext/>
-        <w:spacing w:after="30"/>
+        <w:spacing w:after="0"/>
       </w:pPr>
       <w:r>
         <w:rPr>
@@ -503,7 +544,7 @@
     <w:p>
       <w:pPr>
         <w:keepNext/>
-        <w:spacing w:after="20"/>
+        <w:spacing w:after="0"/>
       </w:pPr>
       <w:r>
         <w:rPr>
@@ -524,7 +565,7 @@
     </w:p>
     <w:p>
       <w:pPr>
-        <w:spacing w:after="30"/>
+        <w:spacing w:after="0"/>
         <w:ind w:left="173" w:hanging="173"/>
       </w:pPr>
       <w:r>
@@ -537,7 +578,7 @@
     <w:p>
       <w:pPr>
         <w:keepNext/>
-        <w:spacing w:after="30"/>
+        <w:spacing w:after="0"/>
       </w:pPr>
       <w:r>
         <w:rPr>
@@ -549,7 +590,7 @@
     <w:p>
       <w:pPr>
         <w:keepNext/>
-        <w:spacing w:after="20"/>
+        <w:spacing w:after="0"/>
       </w:pPr>
       <w:r>
         <w:rPr>
@@ -570,7 +611,7 @@
     </w:p>
     <w:p>
       <w:pPr>
-        <w:spacing w:after="30"/>
+        <w:spacing w:after="0"/>
         <w:ind w:left="173" w:hanging="173"/>
       </w:pPr>
       <w:r>
@@ -583,7 +624,7 @@
     <w:p>
       <w:pPr>
         <w:pStyle w:val="Heading1"/>
-        <w:spacing w:before="100"/>
+        <w:spacing w:before="60" w:after="0"/>
         <w:pBdr>
           <w:bottom w:val="single" w:sz="4" w:color="B9D8E6" w:space="3"/>
         </w:pBdr>
@@ -618,7 +659,7 @@
     </w:p>
     <w:p>
       <w:pPr>
-        <w:spacing w:after="40"/>
+        <w:spacing w:after="0"/>
       </w:pPr>
       <w:r>
         <w:rPr>
@@ -651,7 +692,7 @@
     </w:p>
     <w:p>
       <w:pPr>
-        <w:spacing w:after="40"/>
+        <w:spacing w:after="0"/>
       </w:pPr>
       <w:r>
         <w:rPr>
@@ -684,7 +725,7 @@
     </w:p>
     <w:p>
       <w:pPr>
-        <w:spacing w:after="40"/>
+        <w:spacing w:after="0"/>
       </w:pPr>
       <w:r>
         <w:rPr>
@@ -697,7 +738,7 @@
     <w:p>
       <w:pPr>
         <w:pStyle w:val="Heading1"/>
-        <w:spacing w:before="100"/>
+        <w:spacing w:before="60" w:after="0"/>
         <w:pBdr>
           <w:bottom w:val="single" w:sz="4" w:color="B9D8E6" w:space="3"/>
         </w:pBdr>
@@ -711,7 +752,7 @@
     </w:p>
     <w:p>
       <w:pPr>
-        <w:spacing w:after="30"/>
+        <w:spacing w:after="0"/>
       </w:pPr>
       <w:r>
         <w:rPr>

</xml_diff>